<commit_message>
Updated Meeting Report 3
</commit_message>
<xml_diff>
--- a/Meeting Reports/Meeting Report 3.docx
+++ b/Meeting Reports/Meeting Report 3.docx
@@ -466,7 +466,6 @@
             <w:sdt>
               <w:sdtPr>
                 <w:id w:val="56139423"/>
-                <w:showingPlcHdr/>
               </w:sdtPr>
               <w:sdtContent>
                 <w:r>
@@ -486,7 +485,16 @@
                     <w:szCs w:val="19"/>
                     <w:lang w:val="en-US" w:eastAsia="en-US" w:bidi="ar-SA"/>
                   </w:rPr>
-                  <w:t>Enter meeting facilitator here</w:t>
+                  <w:t>Mathias Hansen</w:t>
+                </w:r>
+                <w:r>
+                  <w:rPr>
+                    <w:rFonts w:eastAsia="ＭＳ Ｐゴシック" w:cs="Arial"/>
+                    <w:kern w:val="0"/>
+                    <w:sz w:val="19"/>
+                    <w:szCs w:val="19"/>
+                    <w:lang w:val="en-US" w:eastAsia="en-US" w:bidi="ar-SA"/>
+                  </w:rPr>
                 </w:r>
               </w:sdtContent>
             </w:sdt>
@@ -730,6 +738,7 @@
               <w:rPr>
                 <w:rFonts w:cs="Arial"/>
               </w:rPr>
+              <w:t>None</w:t>
             </w:r>
           </w:p>
         </w:tc>
@@ -1161,7 +1170,7 @@
             <w:rPr>
               <w:rFonts w:cs="Arial"/>
             </w:rPr>
-            <w:t>Organising which member is going to do which tasks</w:t>
+            <w:t>Organising which member is going to do which tasks. This includes the meeting documentation, and writing/modifying the three HTML files for the project – Home, Products, and Orders. A Risk Registry also needs to be established for future tasks to ensure the project stays on track.</w:t>
           </w:r>
         </w:sdtContent>
       </w:sdt>
@@ -1672,7 +1681,16 @@
                     <w:szCs w:val="19"/>
                     <w:lang w:val="en-US" w:eastAsia="en-US" w:bidi="ar-SA"/>
                   </w:rPr>
-                  <w:t>In Progress</w:t>
+                  <w:t>15/5/26</w:t>
+                </w:r>
+                <w:r>
+                  <w:rPr>
+                    <w:rFonts w:eastAsia="ＭＳ Ｐゴシック" w:cs="Arial"/>
+                    <w:kern w:val="0"/>
+                    <w:sz w:val="19"/>
+                    <w:szCs w:val="19"/>
+                    <w:lang w:val="en-US" w:eastAsia="en-US" w:bidi="ar-SA"/>
+                  </w:rPr>
                 </w:r>
               </w:sdtContent>
             </w:sdt>
@@ -1820,7 +1838,16 @@
                     <w:szCs w:val="19"/>
                     <w:lang w:val="en-US" w:eastAsia="en-US" w:bidi="ar-SA"/>
                   </w:rPr>
-                  <w:t>In Progress</w:t>
+                  <w:t>16/5/26</w:t>
+                </w:r>
+                <w:r>
+                  <w:rPr>
+                    <w:rFonts w:eastAsia="ＭＳ Ｐゴシック" w:cs="Arial"/>
+                    <w:kern w:val="0"/>
+                    <w:sz w:val="19"/>
+                    <w:szCs w:val="19"/>
+                    <w:lang w:val="en-US" w:eastAsia="en-US" w:bidi="ar-SA"/>
+                  </w:rPr>
                 </w:r>
               </w:sdtContent>
             </w:sdt>
@@ -2014,7 +2041,7 @@
             <w:rPr>
               <w:rFonts w:cs="Arial"/>
             </w:rPr>
-            <w:t>Once previous tasks are completed, files need to be uploaded and ensure they all work together with no issues. Cannot begin until files are written and uploaded.</w:t>
+            <w:t>Once previous tasks are completed, files need to be uploaded and ensure they all work together with no issues. This task cannot begin until files are written and uploaded to the repository.</w:t>
           </w:r>
         </w:sdtContent>
       </w:sdt>
@@ -2057,7 +2084,6 @@
       <w:sdt>
         <w:sdtPr>
           <w:id w:val="1699276047"/>
-          <w:showingPlcHdr/>
           <w:text/>
         </w:sdtPr>
         <w:sdtContent>
@@ -2070,7 +2096,7 @@
             <w:rPr>
               <w:rFonts w:cs="Arial"/>
             </w:rPr>
-            <w:t>Enter conclusions here.</w:t>
+            <w:t>After uploading, everything was confirmed to work with the changes made to the base document. Minor issues were found in the process of testing but all were completed quickly and the site has no given problems with its layout or organisation.</w:t>
           </w:r>
         </w:sdtContent>
       </w:sdt>
@@ -2411,7 +2437,26 @@
                     <w:szCs w:val="19"/>
                     <w:lang w:val="en-US" w:eastAsia="en-US" w:bidi="ar-SA"/>
                   </w:rPr>
-                  <w:t>Confirm validity</w:t>
+                  <w:t xml:space="preserve">Confirm validity </w:t>
+                </w:r>
+                <w:r>
+                  <w:rPr>
+                    <w:rFonts w:eastAsia="ＭＳ Ｐゴシック" w:cs="Arial"/>
+                    <w:kern w:val="0"/>
+                    <w:sz w:val="19"/>
+                    <w:szCs w:val="19"/>
+                    <w:lang w:val="en-US" w:eastAsia="en-US" w:bidi="ar-SA"/>
+                  </w:rPr>
+                  <w:t>+ Adjustments</w:t>
+                </w:r>
+                <w:r>
+                  <w:rPr>
+                    <w:rFonts w:eastAsia="ＭＳ Ｐゴシック" w:cs="Arial"/>
+                    <w:kern w:val="0"/>
+                    <w:sz w:val="19"/>
+                    <w:szCs w:val="19"/>
+                    <w:lang w:val="en-US" w:eastAsia="en-US" w:bidi="ar-SA"/>
+                  </w:rPr>
                 </w:r>
               </w:sdtContent>
             </w:sdt>
@@ -2513,109 +2558,9 @@
           <w:rFonts w:cs="Arial"/>
         </w:rPr>
       </w:pPr>
-      <w:sdt>
-        <w:sdtPr>
-          <w:id w:val="-98801915"/>
-          <w:showingPlcHdr/>
-        </w:sdtPr>
-        <w:sdtContent>
-          <w:r>
-            <w:rPr>
-              <w:rFonts w:cs="Arial"/>
-            </w:rPr>
-          </w:r>
-          <w:r>
-            <w:rPr>
-              <w:rFonts w:cs="Arial"/>
-            </w:rPr>
-            <w:t>Discussion:</w:t>
-          </w:r>
-        </w:sdtContent>
-      </w:sdt>
-    </w:p>
-    <w:p>
-      <w:pPr>
-        <w:pStyle w:val="Normal"/>
-        <w:rPr>
-          <w:rFonts w:cs="Arial"/>
-        </w:rPr>
-      </w:pPr>
-      <w:sdt>
-        <w:sdtPr>
-          <w:id w:val="-1975671269"/>
-          <w:showingPlcHdr/>
-          <w:text/>
-        </w:sdtPr>
-        <w:sdtContent>
-          <w:r>
-            <w:rPr>
-              <w:rFonts w:cs="Arial"/>
-            </w:rPr>
-          </w:r>
-          <w:r>
-            <w:rPr>
-              <w:rFonts w:cs="Arial"/>
-            </w:rPr>
-            <w:t>To get started right away, just tap any placeholder text (such as this) and start typing to replace it with your own.</w:t>
-          </w:r>
-        </w:sdtContent>
-      </w:sdt>
-    </w:p>
-    <w:p>
-      <w:pPr>
-        <w:pStyle w:val="Heading4"/>
-        <w:ind w:hanging="0" w:start="0"/>
-        <w:rPr>
-          <w:rFonts w:cs="Arial"/>
-        </w:rPr>
-      </w:pPr>
-      <w:sdt>
-        <w:sdtPr>
-          <w:id w:val="-1388485399"/>
-          <w:showingPlcHdr/>
-        </w:sdtPr>
-        <w:sdtContent>
-          <w:r>
-            <w:rPr>
-              <w:rFonts w:cs="Arial"/>
-            </w:rPr>
-          </w:r>
-          <w:r>
-            <w:rPr>
-              <w:rFonts w:cs="Arial"/>
-            </w:rPr>
-            <w:t>Conclusions:</w:t>
-          </w:r>
-        </w:sdtContent>
-      </w:sdt>
-    </w:p>
-    <w:p>
-      <w:pPr>
-        <w:pStyle w:val="Normal"/>
-        <w:rPr>
-          <w:rFonts w:cs="Arial"/>
-        </w:rPr>
-      </w:pPr>
-      <w:sdt>
-        <w:sdtPr>
-          <w:id w:val="-1873522740"/>
-          <w:showingPlcHdr/>
-          <w:text/>
-        </w:sdtPr>
-        <w:sdtContent>
-          <w:r>
-            <w:rPr>
-              <w:rFonts w:cs="Arial"/>
-            </w:rPr>
-          </w:r>
-          <w:r>
-            <w:rPr>
-              <w:rFonts w:cs="Arial"/>
-            </w:rPr>
-            <w:t>Enter conclusions here.</w:t>
-          </w:r>
-        </w:sdtContent>
-      </w:sdt>
+      <w:r>
+        <w:rPr/>
+      </w:r>
     </w:p>
     <w:p>
       <w:pPr>
@@ -2691,7 +2636,6 @@
       <w:sdt>
         <w:sdtPr>
           <w:id w:val="-1742867320"/>
-          <w:showingPlcHdr/>
           <w:text/>
         </w:sdtPr>
         <w:sdtContent>
@@ -2704,7 +2648,7 @@
             <w:rPr>
               <w:rFonts w:cs="Arial"/>
             </w:rPr>
-            <w:t>Enter resources here.</w:t>
+            <w:t>GitHub Repository, planning documents, base HTML templates.</w:t>
           </w:r>
         </w:sdtContent>
       </w:sdt>
@@ -2734,7 +2678,6 @@
       <w:sdt>
         <w:sdtPr>
           <w:id w:val="1712002868"/>
-          <w:showingPlcHdr/>
           <w:text/>
         </w:sdtPr>
         <w:sdtContent>
@@ -2747,7 +2690,7 @@
             <w:rPr>
               <w:rFonts w:cs="Arial"/>
             </w:rPr>
-            <w:t>Enter any special notes here.</w:t>
+            <w:t>Final project meeting</w:t>
           </w:r>
         </w:sdtContent>
       </w:sdt>

</xml_diff>